<commit_message>
feat: mode nuit toggle + fix lisibilité titres zones en mode sombre (v144)
</commit_message>
<xml_diff>
--- a/MonSucre-Expertise-Financiere.docx
+++ b/MonSucre-Expertise-Financiere.docx
@@ -10081,6 +10081,1870 @@
           <w:szCs w:val="22"/>
         </w:rPr>
         <w:t xml:space="preserve">L'implémentation du cache TTS est la priorité n°1 avant toute commercialisation.</w:t>
+      </w:r>
+    </w:p>
+    <w:p>
+      <w:r>
+        <w:t xml:space="preserve"/>
+      </w:r>
+    </w:p>
+    <w:p>
+      <w:pPr>
+        <w:pStyle w:val="Heading1"/>
+        <w:pBdr>
+          <w:bottom w:val="single" w:color="0B6650" w:sz="4" w:space="6"/>
+        </w:pBdr>
+        <w:spacing w:after="200" w:before="400"/>
+      </w:pPr>
+      <w:r>
+        <w:rPr>
+          <w:rFonts w:ascii="Arial" w:cs="Arial" w:eastAsia="Arial" w:hAnsi="Arial"/>
+          <w:b/>
+          <w:bCs/>
+          <w:color w:val="1D3A6E"/>
+          <w:sz w:val="32"/>
+          <w:szCs w:val="32"/>
+        </w:rPr>
+        <w:t xml:space="preserve">8. Passage en Application Native (iOS &amp; Android)</w:t>
+      </w:r>
+    </w:p>
+    <w:p>
+      <w:pPr>
+        <w:spacing w:after="100" w:before="80"/>
+      </w:pPr>
+      <w:r>
+        <w:rPr>
+          <w:rFonts w:ascii="Arial" w:cs="Arial" w:eastAsia="Arial" w:hAnsi="Arial"/>
+          <w:color w:val="1E1E1E"/>
+          <w:sz w:val="22"/>
+          <w:szCs w:val="22"/>
+        </w:rPr>
+        <w:t xml:space="preserve">Mon Sucre est actuellement une Progressive Web App, technologie suffisante pour un lancement rapide. Le passage en application native iOS et Android représente une étape future naturelle si la base d’utilisateurs croît ou si des fonctionnalités spécifiques à la plateforme deviennent nécessaires (Bluetooth glucomètre, HealthKit). Cette section analyse les coûts et implications de cette transition.</w:t>
+      </w:r>
+    </w:p>
+    <w:p>
+      <w:pPr>
+        <w:pStyle w:val="Heading2"/>
+        <w:spacing w:after="120" w:before="280"/>
+      </w:pPr>
+      <w:r>
+        <w:rPr>
+          <w:rFonts w:ascii="Arial" w:cs="Arial" w:eastAsia="Arial" w:hAnsi="Arial"/>
+          <w:b/>
+          <w:bCs/>
+          <w:color w:val="0B6650"/>
+          <w:sz w:val="26"/>
+          <w:szCs w:val="26"/>
+        </w:rPr>
+        <w:t xml:space="preserve">8.1 Approches de Développement Natif</w:t>
+      </w:r>
+    </w:p>
+    <w:p>
+      <w:pPr>
+        <w:spacing w:after="60" w:before="60"/>
+      </w:pPr>
+      <w:r>
+        <w:rPr>
+          <w:rFonts w:ascii="Arial" w:cs="Arial" w:eastAsia="Arial" w:hAnsi="Arial"/>
+          <w:color w:val="1E1E1E"/>
+          <w:sz w:val="22"/>
+          <w:szCs w:val="22"/>
+        </w:rPr>
+        <w:t xml:space="preserve">Deux stratégies sont envisageables :</w:t>
+      </w:r>
+    </w:p>
+    <w:p>
+      <w:pPr>
+        <w:spacing w:after="40" w:before="80"/>
+      </w:pPr>
+      <w:r>
+        <w:rPr>
+          <w:rFonts w:ascii="Arial" w:cs="Arial" w:eastAsia="Arial" w:hAnsi="Arial"/>
+          <w:b/>
+          <w:bCs/>
+          <w:color w:val="1D3A6E"/>
+          <w:sz w:val="22"/>
+          <w:szCs w:val="22"/>
+        </w:rPr>
+        <w:t xml:space="preserve">Approche A — Multiplateforme (React Native ou Flutter)</w:t>
+      </w:r>
+    </w:p>
+    <w:p>
+      <w:pPr>
+        <w:spacing w:after="40" w:before="40"/>
+      </w:pPr>
+      <w:r>
+        <w:rPr>
+          <w:rFonts w:ascii="Arial" w:cs="Arial" w:eastAsia="Arial" w:hAnsi="Arial"/>
+          <w:color w:val="1E1E1E"/>
+          <w:sz w:val="22"/>
+          <w:szCs w:val="22"/>
+        </w:rPr>
+        <w:t xml:space="preserve">Une base de code unique génère les apps iOS et Android. La logique métier (API calls, cache Redis, TTS) peut être réutilisée à ~60 %, mais l’interface doit être entièrement réécrite en composants natifs.</w:t>
+      </w:r>
+    </w:p>
+    <w:p>
+      <w:pPr>
+        <w:spacing w:after="40" w:before="80"/>
+      </w:pPr>
+      <w:r>
+        <w:rPr>
+          <w:rFonts w:ascii="Arial" w:cs="Arial" w:eastAsia="Arial" w:hAnsi="Arial"/>
+          <w:b/>
+          <w:bCs/>
+          <w:color w:val="1D3A6E"/>
+          <w:sz w:val="22"/>
+          <w:szCs w:val="22"/>
+        </w:rPr>
+        <w:t xml:space="preserve">Approche B — Natif pur (Swift/SwiftUI + Kotlin)</w:t>
+      </w:r>
+    </w:p>
+    <w:p>
+      <w:pPr>
+        <w:spacing w:after="40" w:before="40"/>
+      </w:pPr>
+      <w:r>
+        <w:rPr>
+          <w:rFonts w:ascii="Arial" w:cs="Arial" w:eastAsia="Arial" w:hAnsi="Arial"/>
+          <w:color w:val="1E1E1E"/>
+          <w:sz w:val="22"/>
+          <w:szCs w:val="22"/>
+        </w:rPr>
+        <w:t xml:space="preserve">Développement séparé pour chaque plateforme. Performances optimales et accès complet aux APIs système (HealthKit, Bluetooth), mais coût double et maintenance double.</w:t>
+      </w:r>
+    </w:p>
+    <w:p>
+      <w:pPr>
+        <w:pStyle w:val="Heading2"/>
+        <w:spacing w:after="120" w:before="280"/>
+      </w:pPr>
+      <w:r>
+        <w:rPr>
+          <w:rFonts w:ascii="Arial" w:cs="Arial" w:eastAsia="Arial" w:hAnsi="Arial"/>
+          <w:b/>
+          <w:bCs/>
+          <w:color w:val="0B6650"/>
+          <w:sz w:val="26"/>
+          <w:szCs w:val="26"/>
+        </w:rPr>
+        <w:t xml:space="preserve">8.2 Coût de Développement</w:t>
+      </w:r>
+    </w:p>
+    <w:tbl>
+      <w:tblPr>
+        <w:tblW w:type="dxa" w:w="9506"/>
+        <w:tblBorders>
+          <w:insideH w:val="single" w:color="D0D5DD" w:sz="1"/>
+          <w:insideV w:val="single" w:color="D0D5DD" w:sz="1"/>
+        </w:tblBorders>
+      </w:tblPr>
+      <w:tblGrid>
+        <w:gridCol w:w="3800"/>
+        <w:gridCol w:w="1902"/>
+        <w:gridCol w:w="1902"/>
+        <w:gridCol w:w="1902"/>
+      </w:tblGrid>
+      <w:tr>
+        <w:trPr>
+          <w:tblHeader/>
+        </w:trPr>
+        <w:tc>
+          <w:tcPr>
+            <w:tcW w:type="dxa" w:w="3800"/>
+            <w:shd w:fill="1D3A6E" w:val="clear"/>
+            <w:tcMar>
+              <w:top w:type="dxa" w:w="100"/>
+              <w:left w:type="dxa" w:w="140"/>
+              <w:bottom w:type="dxa" w:w="100"/>
+              <w:right w:type="dxa" w:w="140"/>
+            </w:tcMar>
+          </w:tcPr>
+          <w:p>
+            <w:r>
+              <w:rPr>
+                <w:rFonts w:ascii="Arial" w:cs="Arial" w:eastAsia="Arial" w:hAnsi="Arial"/>
+                <w:b/>
+                <w:bCs/>
+                <w:color w:val="FFFFFF"/>
+                <w:sz w:val="20"/>
+                <w:szCs w:val="20"/>
+              </w:rPr>
+              <w:t>Poste</w:t>
+            </w:r>
+          </w:p>
+        </w:tc>
+        <w:tc>
+          <w:tcPr>
+            <w:tcW w:type="dxa" w:w="1902"/>
+            <w:shd w:fill="1D3A6E" w:val="clear"/>
+            <w:tcMar>
+              <w:top w:type="dxa" w:w="100"/>
+              <w:left w:type="dxa" w:w="140"/>
+              <w:bottom w:type="dxa" w:w="100"/>
+              <w:right w:type="dxa" w:w="140"/>
+            </w:tcMar>
+          </w:tcPr>
+          <w:p>
+            <w:r>
+              <w:rPr>
+                <w:rFonts w:ascii="Arial" w:cs="Arial" w:eastAsia="Arial" w:hAnsi="Arial"/>
+                <w:b/>
+                <w:bCs/>
+                <w:color w:val="FFFFFF"/>
+                <w:sz w:val="20"/>
+                <w:szCs w:val="20"/>
+              </w:rPr>
+              <w:t>Classique</w:t>
+            </w:r>
+          </w:p>
+        </w:tc>
+        <w:tc>
+          <w:tcPr>
+            <w:tcW w:type="dxa" w:w="1902"/>
+            <w:shd w:fill="1D3A6E" w:val="clear"/>
+            <w:tcMar>
+              <w:top w:type="dxa" w:w="100"/>
+              <w:left w:type="dxa" w:w="140"/>
+              <w:bottom w:type="dxa" w:w="100"/>
+              <w:right w:type="dxa" w:w="140"/>
+            </w:tcMar>
+          </w:tcPr>
+          <w:p>
+            <w:r>
+              <w:rPr>
+                <w:rFonts w:ascii="Arial" w:cs="Arial" w:eastAsia="Arial" w:hAnsi="Arial"/>
+                <w:b/>
+                <w:bCs/>
+                <w:color w:val="FFFFFF"/>
+                <w:sz w:val="20"/>
+                <w:szCs w:val="20"/>
+              </w:rPr>
+              <w:t>Assisté IA</w:t>
+            </w:r>
+          </w:p>
+        </w:tc>
+        <w:tc>
+          <w:tcPr>
+            <w:tcW w:type="dxa" w:w="1902"/>
+            <w:shd w:fill="1D3A6E" w:val="clear"/>
+            <w:tcMar>
+              <w:top w:type="dxa" w:w="100"/>
+              <w:left w:type="dxa" w:w="140"/>
+              <w:bottom w:type="dxa" w:w="100"/>
+              <w:right w:type="dxa" w:w="140"/>
+            </w:tcMar>
+          </w:tcPr>
+          <w:p>
+            <w:r>
+              <w:rPr>
+                <w:rFonts w:ascii="Arial" w:cs="Arial" w:eastAsia="Arial" w:hAnsi="Arial"/>
+                <w:b/>
+                <w:bCs/>
+                <w:color w:val="FFFFFF"/>
+                <w:sz w:val="20"/>
+                <w:szCs w:val="20"/>
+              </w:rPr>
+              <w:t>Natif pur</w:t>
+            </w:r>
+          </w:p>
+        </w:tc>
+      </w:tr>
+      <w:tr>
+        <w:tc>
+          <w:tcPr>
+            <w:tcW w:type="dxa" w:w="3800"/>
+            <w:shd w:fill="F0F4FA" w:val="clear"/>
+            <w:tcMar>
+              <w:top w:type="dxa" w:w="100"/>
+              <w:left w:type="dxa" w:w="140"/>
+              <w:bottom w:type="dxa" w:w="100"/>
+              <w:right w:type="dxa" w:w="140"/>
+            </w:tcMar>
+          </w:tcPr>
+          <w:p>
+            <w:r>
+              <w:rPr>
+                <w:rFonts w:ascii="Arial" w:cs="Arial" w:eastAsia="Arial" w:hAnsi="Arial"/>
+                <w:color w:val="1E1E1E"/>
+                <w:sz w:val="20"/>
+                <w:szCs w:val="20"/>
+              </w:rPr>
+              <w:t xml:space="preserve">Réécriture UI en composants natifs</w:t>
+            </w:r>
+          </w:p>
+        </w:tc>
+        <w:tc>
+          <w:tcPr>
+            <w:tcW w:type="dxa" w:w="1902"/>
+            <w:shd w:fill="F0F4FA" w:val="clear"/>
+            <w:tcMar>
+              <w:top w:type="dxa" w:w="100"/>
+              <w:left w:type="dxa" w:w="140"/>
+              <w:bottom w:type="dxa" w:w="100"/>
+              <w:right w:type="dxa" w:w="140"/>
+            </w:tcMar>
+          </w:tcPr>
+          <w:p>
+            <w:r>
+              <w:rPr>
+                <w:rFonts w:ascii="Arial" w:cs="Arial" w:eastAsia="Arial" w:hAnsi="Arial"/>
+                <w:color w:val="1E1E1E"/>
+                <w:sz w:val="20"/>
+                <w:szCs w:val="20"/>
+              </w:rPr>
+              <w:t xml:space="preserve">20 j → €16 000</w:t>
+            </w:r>
+          </w:p>
+        </w:tc>
+        <w:tc>
+          <w:tcPr>
+            <w:tcW w:type="dxa" w:w="1902"/>
+            <w:shd w:fill="F0F4FA" w:val="clear"/>
+            <w:tcMar>
+              <w:top w:type="dxa" w:w="100"/>
+              <w:left w:type="dxa" w:w="140"/>
+              <w:bottom w:type="dxa" w:w="100"/>
+              <w:right w:type="dxa" w:w="140"/>
+            </w:tcMar>
+          </w:tcPr>
+          <w:p>
+            <w:r>
+              <w:rPr>
+                <w:rFonts w:ascii="Arial" w:cs="Arial" w:eastAsia="Arial" w:hAnsi="Arial"/>
+                <w:color w:val="1E1E1E"/>
+                <w:sz w:val="20"/>
+                <w:szCs w:val="20"/>
+              </w:rPr>
+              <w:t xml:space="preserve">~4 j → €600</w:t>
+            </w:r>
+          </w:p>
+        </w:tc>
+        <w:tc>
+          <w:tcPr>
+            <w:tcW w:type="dxa" w:w="1902"/>
+            <w:shd w:fill="F0F4FA" w:val="clear"/>
+            <w:tcMar>
+              <w:top w:type="dxa" w:w="100"/>
+              <w:left w:type="dxa" w:w="140"/>
+              <w:bottom w:type="dxa" w:w="100"/>
+              <w:right w:type="dxa" w:w="140"/>
+            </w:tcMar>
+          </w:tcPr>
+          <w:p>
+            <w:r>
+              <w:rPr>
+                <w:rFonts w:ascii="Arial" w:cs="Arial" w:eastAsia="Arial" w:hAnsi="Arial"/>
+                <w:color w:val="1E1E1E"/>
+                <w:sz w:val="20"/>
+                <w:szCs w:val="20"/>
+              </w:rPr>
+              <w:t xml:space="preserve">40 j → €32 000</w:t>
+            </w:r>
+          </w:p>
+        </w:tc>
+      </w:tr>
+      <w:tr>
+        <w:tc>
+          <w:tcPr>
+            <w:tcW w:type="dxa" w:w="3800"/>
+            <w:shd w:fill="FFFFFF" w:val="clear"/>
+            <w:tcMar>
+              <w:top w:type="dxa" w:w="100"/>
+              <w:left w:type="dxa" w:w="140"/>
+              <w:bottom w:type="dxa" w:w="100"/>
+              <w:right w:type="dxa" w:w="140"/>
+            </w:tcMar>
+          </w:tcPr>
+          <w:p>
+            <w:r>
+              <w:rPr>
+                <w:rFonts w:ascii="Arial" w:cs="Arial" w:eastAsia="Arial" w:hAnsi="Arial"/>
+                <w:color w:val="1E1E1E"/>
+                <w:sz w:val="20"/>
+                <w:szCs w:val="20"/>
+              </w:rPr>
+              <w:t xml:space="preserve">Adaptation logique métier</w:t>
+            </w:r>
+          </w:p>
+        </w:tc>
+        <w:tc>
+          <w:tcPr>
+            <w:tcW w:type="dxa" w:w="1902"/>
+            <w:shd w:fill="FFFFFF" w:val="clear"/>
+            <w:tcMar>
+              <w:top w:type="dxa" w:w="100"/>
+              <w:left w:type="dxa" w:w="140"/>
+              <w:bottom w:type="dxa" w:w="100"/>
+              <w:right w:type="dxa" w:w="140"/>
+            </w:tcMar>
+          </w:tcPr>
+          <w:p>
+            <w:r>
+              <w:rPr>
+                <w:rFonts w:ascii="Arial" w:cs="Arial" w:eastAsia="Arial" w:hAnsi="Arial"/>
+                <w:color w:val="1E1E1E"/>
+                <w:sz w:val="20"/>
+                <w:szCs w:val="20"/>
+              </w:rPr>
+              <w:t xml:space="preserve">5 j → €4 000</w:t>
+            </w:r>
+          </w:p>
+        </w:tc>
+        <w:tc>
+          <w:tcPr>
+            <w:tcW w:type="dxa" w:w="1902"/>
+            <w:shd w:fill="FFFFFF" w:val="clear"/>
+            <w:tcMar>
+              <w:top w:type="dxa" w:w="100"/>
+              <w:left w:type="dxa" w:w="140"/>
+              <w:bottom w:type="dxa" w:w="100"/>
+              <w:right w:type="dxa" w:w="140"/>
+            </w:tcMar>
+          </w:tcPr>
+          <w:p>
+            <w:r>
+              <w:rPr>
+                <w:rFonts w:ascii="Arial" w:cs="Arial" w:eastAsia="Arial" w:hAnsi="Arial"/>
+                <w:color w:val="1E1E1E"/>
+                <w:sz w:val="20"/>
+                <w:szCs w:val="20"/>
+              </w:rPr>
+              <w:t xml:space="preserve">~1 j → €150</w:t>
+            </w:r>
+          </w:p>
+        </w:tc>
+        <w:tc>
+          <w:tcPr>
+            <w:tcW w:type="dxa" w:w="1902"/>
+            <w:shd w:fill="FFFFFF" w:val="clear"/>
+            <w:tcMar>
+              <w:top w:type="dxa" w:w="100"/>
+              <w:left w:type="dxa" w:w="140"/>
+              <w:bottom w:type="dxa" w:w="100"/>
+              <w:right w:type="dxa" w:w="140"/>
+            </w:tcMar>
+          </w:tcPr>
+          <w:p>
+            <w:r>
+              <w:rPr>
+                <w:rFonts w:ascii="Arial" w:cs="Arial" w:eastAsia="Arial" w:hAnsi="Arial"/>
+                <w:color w:val="1E1E1E"/>
+                <w:sz w:val="20"/>
+                <w:szCs w:val="20"/>
+              </w:rPr>
+              <w:t xml:space="preserve">10 j → €8 000</w:t>
+            </w:r>
+          </w:p>
+        </w:tc>
+      </w:tr>
+      <w:tr>
+        <w:tc>
+          <w:tcPr>
+            <w:tcW w:type="dxa" w:w="3800"/>
+            <w:shd w:fill="F0F4FA" w:val="clear"/>
+            <w:tcMar>
+              <w:top w:type="dxa" w:w="100"/>
+              <w:left w:type="dxa" w:w="140"/>
+              <w:bottom w:type="dxa" w:w="100"/>
+              <w:right w:type="dxa" w:w="140"/>
+            </w:tcMar>
+          </w:tcPr>
+          <w:p>
+            <w:r>
+              <w:rPr>
+                <w:rFonts w:ascii="Arial" w:cs="Arial" w:eastAsia="Arial" w:hAnsi="Arial"/>
+                <w:color w:val="1E1E1E"/>
+                <w:sz w:val="20"/>
+                <w:szCs w:val="20"/>
+              </w:rPr>
+              <w:t xml:space="preserve">Notifications push natives (APNs + FCM)</w:t>
+            </w:r>
+          </w:p>
+        </w:tc>
+        <w:tc>
+          <w:tcPr>
+            <w:tcW w:type="dxa" w:w="1902"/>
+            <w:shd w:fill="F0F4FA" w:val="clear"/>
+            <w:tcMar>
+              <w:top w:type="dxa" w:w="100"/>
+              <w:left w:type="dxa" w:w="140"/>
+              <w:bottom w:type="dxa" w:w="100"/>
+              <w:right w:type="dxa" w:w="140"/>
+            </w:tcMar>
+          </w:tcPr>
+          <w:p>
+            <w:r>
+              <w:rPr>
+                <w:rFonts w:ascii="Arial" w:cs="Arial" w:eastAsia="Arial" w:hAnsi="Arial"/>
+                <w:color w:val="1E1E1E"/>
+                <w:sz w:val="20"/>
+                <w:szCs w:val="20"/>
+              </w:rPr>
+              <w:t xml:space="preserve">3 j → €2 400</w:t>
+            </w:r>
+          </w:p>
+        </w:tc>
+        <w:tc>
+          <w:tcPr>
+            <w:tcW w:type="dxa" w:w="1902"/>
+            <w:shd w:fill="F0F4FA" w:val="clear"/>
+            <w:tcMar>
+              <w:top w:type="dxa" w:w="100"/>
+              <w:left w:type="dxa" w:w="140"/>
+              <w:bottom w:type="dxa" w:w="100"/>
+              <w:right w:type="dxa" w:w="140"/>
+            </w:tcMar>
+          </w:tcPr>
+          <w:p>
+            <w:r>
+              <w:rPr>
+                <w:rFonts w:ascii="Arial" w:cs="Arial" w:eastAsia="Arial" w:hAnsi="Arial"/>
+                <w:color w:val="1E1E1E"/>
+                <w:sz w:val="20"/>
+                <w:szCs w:val="20"/>
+              </w:rPr>
+              <w:t xml:space="preserve">~0,5 j → €75</w:t>
+            </w:r>
+          </w:p>
+        </w:tc>
+        <w:tc>
+          <w:tcPr>
+            <w:tcW w:type="dxa" w:w="1902"/>
+            <w:shd w:fill="F0F4FA" w:val="clear"/>
+            <w:tcMar>
+              <w:top w:type="dxa" w:w="100"/>
+              <w:left w:type="dxa" w:w="140"/>
+              <w:bottom w:type="dxa" w:w="100"/>
+              <w:right w:type="dxa" w:w="140"/>
+            </w:tcMar>
+          </w:tcPr>
+          <w:p>
+            <w:r>
+              <w:rPr>
+                <w:rFonts w:ascii="Arial" w:cs="Arial" w:eastAsia="Arial" w:hAnsi="Arial"/>
+                <w:color w:val="1E1E1E"/>
+                <w:sz w:val="20"/>
+                <w:szCs w:val="20"/>
+              </w:rPr>
+              <w:t xml:space="preserve">6 j → €4 800</w:t>
+            </w:r>
+          </w:p>
+        </w:tc>
+      </w:tr>
+      <w:tr>
+        <w:tc>
+          <w:tcPr>
+            <w:tcW w:type="dxa" w:w="3800"/>
+            <w:shd w:fill="FFFFFF" w:val="clear"/>
+            <w:tcMar>
+              <w:top w:type="dxa" w:w="100"/>
+              <w:left w:type="dxa" w:w="140"/>
+              <w:bottom w:type="dxa" w:w="100"/>
+              <w:right w:type="dxa" w:w="140"/>
+            </w:tcMar>
+          </w:tcPr>
+          <w:p>
+            <w:r>
+              <w:rPr>
+                <w:rFonts w:ascii="Arial" w:cs="Arial" w:eastAsia="Arial" w:hAnsi="Arial"/>
+                <w:color w:val="1E1E1E"/>
+                <w:sz w:val="20"/>
+                <w:szCs w:val="20"/>
+              </w:rPr>
+              <w:t xml:space="preserve">Intégration HealthKit / Google Fit</w:t>
+            </w:r>
+          </w:p>
+        </w:tc>
+        <w:tc>
+          <w:tcPr>
+            <w:tcW w:type="dxa" w:w="1902"/>
+            <w:shd w:fill="FFFFFF" w:val="clear"/>
+            <w:tcMar>
+              <w:top w:type="dxa" w:w="100"/>
+              <w:left w:type="dxa" w:w="140"/>
+              <w:bottom w:type="dxa" w:w="100"/>
+              <w:right w:type="dxa" w:w="140"/>
+            </w:tcMar>
+          </w:tcPr>
+          <w:p>
+            <w:r>
+              <w:rPr>
+                <w:rFonts w:ascii="Arial" w:cs="Arial" w:eastAsia="Arial" w:hAnsi="Arial"/>
+                <w:color w:val="1E1E1E"/>
+                <w:sz w:val="20"/>
+                <w:szCs w:val="20"/>
+              </w:rPr>
+              <w:t xml:space="preserve">5 j → €4 000</w:t>
+            </w:r>
+          </w:p>
+        </w:tc>
+        <w:tc>
+          <w:tcPr>
+            <w:tcW w:type="dxa" w:w="1902"/>
+            <w:shd w:fill="FFFFFF" w:val="clear"/>
+            <w:tcMar>
+              <w:top w:type="dxa" w:w="100"/>
+              <w:left w:type="dxa" w:w="140"/>
+              <w:bottom w:type="dxa" w:w="100"/>
+              <w:right w:type="dxa" w:w="140"/>
+            </w:tcMar>
+          </w:tcPr>
+          <w:p>
+            <w:r>
+              <w:rPr>
+                <w:rFonts w:ascii="Arial" w:cs="Arial" w:eastAsia="Arial" w:hAnsi="Arial"/>
+                <w:color w:val="1E1E1E"/>
+                <w:sz w:val="20"/>
+                <w:szCs w:val="20"/>
+              </w:rPr>
+              <w:t xml:space="preserve">~1 j → €150</w:t>
+            </w:r>
+          </w:p>
+        </w:tc>
+        <w:tc>
+          <w:tcPr>
+            <w:tcW w:type="dxa" w:w="1902"/>
+            <w:shd w:fill="FFFFFF" w:val="clear"/>
+            <w:tcMar>
+              <w:top w:type="dxa" w:w="100"/>
+              <w:left w:type="dxa" w:w="140"/>
+              <w:bottom w:type="dxa" w:w="100"/>
+              <w:right w:type="dxa" w:w="140"/>
+            </w:tcMar>
+          </w:tcPr>
+          <w:p>
+            <w:r>
+              <w:rPr>
+                <w:rFonts w:ascii="Arial" w:cs="Arial" w:eastAsia="Arial" w:hAnsi="Arial"/>
+                <w:color w:val="1E1E1E"/>
+                <w:sz w:val="20"/>
+                <w:szCs w:val="20"/>
+              </w:rPr>
+              <w:t xml:space="preserve">10 j → €8 000</w:t>
+            </w:r>
+          </w:p>
+        </w:tc>
+      </w:tr>
+      <w:tr>
+        <w:tc>
+          <w:tcPr>
+            <w:tcW w:type="dxa" w:w="3800"/>
+            <w:shd w:fill="F0F4FA" w:val="clear"/>
+            <w:tcMar>
+              <w:top w:type="dxa" w:w="100"/>
+              <w:left w:type="dxa" w:w="140"/>
+              <w:bottom w:type="dxa" w:w="100"/>
+              <w:right w:type="dxa" w:w="140"/>
+            </w:tcMar>
+          </w:tcPr>
+          <w:p>
+            <w:r>
+              <w:rPr>
+                <w:rFonts w:ascii="Arial" w:cs="Arial" w:eastAsia="Arial" w:hAnsi="Arial"/>
+                <w:color w:val="1E1E1E"/>
+                <w:sz w:val="20"/>
+                <w:szCs w:val="20"/>
+              </w:rPr>
+              <w:t xml:space="preserve">Tests, soumission stores, révision Apple</w:t>
+            </w:r>
+          </w:p>
+        </w:tc>
+        <w:tc>
+          <w:tcPr>
+            <w:tcW w:type="dxa" w:w="1902"/>
+            <w:shd w:fill="F0F4FA" w:val="clear"/>
+            <w:tcMar>
+              <w:top w:type="dxa" w:w="100"/>
+              <w:left w:type="dxa" w:w="140"/>
+              <w:bottom w:type="dxa" w:w="100"/>
+              <w:right w:type="dxa" w:w="140"/>
+            </w:tcMar>
+          </w:tcPr>
+          <w:p>
+            <w:r>
+              <w:rPr>
+                <w:rFonts w:ascii="Arial" w:cs="Arial" w:eastAsia="Arial" w:hAnsi="Arial"/>
+                <w:color w:val="1E1E1E"/>
+                <w:sz w:val="20"/>
+                <w:szCs w:val="20"/>
+              </w:rPr>
+              <w:t xml:space="preserve">5 j → €4 000</w:t>
+            </w:r>
+          </w:p>
+        </w:tc>
+        <w:tc>
+          <w:tcPr>
+            <w:tcW w:type="dxa" w:w="1902"/>
+            <w:shd w:fill="F0F4FA" w:val="clear"/>
+            <w:tcMar>
+              <w:top w:type="dxa" w:w="100"/>
+              <w:left w:type="dxa" w:w="140"/>
+              <w:bottom w:type="dxa" w:w="100"/>
+              <w:right w:type="dxa" w:w="140"/>
+            </w:tcMar>
+          </w:tcPr>
+          <w:p>
+            <w:r>
+              <w:rPr>
+                <w:rFonts w:ascii="Arial" w:cs="Arial" w:eastAsia="Arial" w:hAnsi="Arial"/>
+                <w:color w:val="1E1E1E"/>
+                <w:sz w:val="20"/>
+                <w:szCs w:val="20"/>
+              </w:rPr>
+              <w:t xml:space="preserve">~1 j → €150</w:t>
+            </w:r>
+          </w:p>
+        </w:tc>
+        <w:tc>
+          <w:tcPr>
+            <w:tcW w:type="dxa" w:w="1902"/>
+            <w:shd w:fill="F0F4FA" w:val="clear"/>
+            <w:tcMar>
+              <w:top w:type="dxa" w:w="100"/>
+              <w:left w:type="dxa" w:w="140"/>
+              <w:bottom w:type="dxa" w:w="100"/>
+              <w:right w:type="dxa" w:w="140"/>
+            </w:tcMar>
+          </w:tcPr>
+          <w:p>
+            <w:r>
+              <w:rPr>
+                <w:rFonts w:ascii="Arial" w:cs="Arial" w:eastAsia="Arial" w:hAnsi="Arial"/>
+                <w:color w:val="1E1E1E"/>
+                <w:sz w:val="20"/>
+                <w:szCs w:val="20"/>
+              </w:rPr>
+              <w:t xml:space="preserve">10 j → €8 000</w:t>
+            </w:r>
+          </w:p>
+        </w:tc>
+      </w:tr>
+      <w:tr>
+        <w:tc>
+          <w:tcPr>
+            <w:tcW w:type="dxa" w:w="3800"/>
+            <w:shd w:fill="FFFFFF" w:val="clear"/>
+            <w:tcMar>
+              <w:top w:type="dxa" w:w="100"/>
+              <w:left w:type="dxa" w:w="140"/>
+              <w:bottom w:type="dxa" w:w="100"/>
+              <w:right w:type="dxa" w:w="140"/>
+            </w:tcMar>
+          </w:tcPr>
+          <w:p>
+            <w:r>
+              <w:rPr>
+                <w:rFonts w:ascii="Arial" w:cs="Arial" w:eastAsia="Arial" w:hAnsi="Arial"/>
+                <w:b/>
+                <w:bCs/>
+                <w:color w:val="1D3A6E"/>
+                <w:sz w:val="20"/>
+                <w:szCs w:val="20"/>
+              </w:rPr>
+              <w:t xml:space="preserve">TOTAL (multiplateforme)</w:t>
+            </w:r>
+          </w:p>
+        </w:tc>
+        <w:tc>
+          <w:tcPr>
+            <w:tcW w:type="dxa" w:w="1902"/>
+            <w:shd w:fill="FFFFFF" w:val="clear"/>
+            <w:tcMar>
+              <w:top w:type="dxa" w:w="100"/>
+              <w:left w:type="dxa" w:w="140"/>
+              <w:bottom w:type="dxa" w:w="100"/>
+              <w:right w:type="dxa" w:w="140"/>
+            </w:tcMar>
+          </w:tcPr>
+          <w:p>
+            <w:r>
+              <w:rPr>
+                <w:rFonts w:ascii="Arial" w:cs="Arial" w:eastAsia="Arial" w:hAnsi="Arial"/>
+                <w:b/>
+                <w:bCs/>
+                <w:color w:val="1D3A6E"/>
+                <w:sz w:val="20"/>
+                <w:szCs w:val="20"/>
+              </w:rPr>
+              <w:t xml:space="preserve">€30 400</w:t>
+            </w:r>
+          </w:p>
+        </w:tc>
+        <w:tc>
+          <w:tcPr>
+            <w:tcW w:type="dxa" w:w="1902"/>
+            <w:shd w:fill="E8F5EE" w:val="clear"/>
+            <w:tcMar>
+              <w:top w:type="dxa" w:w="100"/>
+              <w:left w:type="dxa" w:w="140"/>
+              <w:bottom w:type="dxa" w:w="100"/>
+              <w:right w:type="dxa" w:w="140"/>
+            </w:tcMar>
+          </w:tcPr>
+          <w:p>
+            <w:r>
+              <w:rPr>
+                <w:rFonts w:ascii="Arial" w:cs="Arial" w:eastAsia="Arial" w:hAnsi="Arial"/>
+                <w:b/>
+                <w:bCs/>
+                <w:color w:val="0B6650"/>
+                <w:sz w:val="20"/>
+                <w:szCs w:val="20"/>
+              </w:rPr>
+              <w:t xml:space="preserve">€1 125</w:t>
+            </w:r>
+          </w:p>
+        </w:tc>
+        <w:tc>
+          <w:tcPr>
+            <w:tcW w:type="dxa" w:w="1902"/>
+            <w:shd w:fill="FFFFFF" w:val="clear"/>
+            <w:tcMar>
+              <w:top w:type="dxa" w:w="100"/>
+              <w:left w:type="dxa" w:w="140"/>
+              <w:bottom w:type="dxa" w:w="100"/>
+              <w:right w:type="dxa" w:w="140"/>
+            </w:tcMar>
+          </w:tcPr>
+          <w:p>
+            <w:r>
+              <w:rPr>
+                <w:rFonts w:ascii="Arial" w:cs="Arial" w:eastAsia="Arial" w:hAnsi="Arial"/>
+                <w:b/>
+                <w:bCs/>
+                <w:color w:val="1D3A6E"/>
+                <w:sz w:val="20"/>
+                <w:szCs w:val="20"/>
+              </w:rPr>
+              <w:t xml:space="preserve">€60 800</w:t>
+            </w:r>
+          </w:p>
+        </w:tc>
+      </w:tr>
+    </w:tbl>
+    <w:p>
+      <w:pPr>
+        <w:spacing w:after="80" w:before="120"/>
+      </w:pPr>
+      <w:r>
+        <w:rPr>
+          <w:rFonts w:ascii="Arial" w:cs="Arial" w:eastAsia="Arial" w:hAnsi="Arial"/>
+          <w:b/>
+          <w:bCs/>
+          <w:color w:val="0B6650"/>
+          <w:sz w:val="22"/>
+          <w:szCs w:val="22"/>
+        </w:rPr>
+        <w:t xml:space="preserve">→  Avec assistance IA, la transition multiplateforme (React Native) est estimée à ~€1 125 de supervision contre €30 400 en développement classique.</w:t>
+      </w:r>
+    </w:p>
+    <w:p>
+      <w:pPr>
+        <w:pStyle w:val="Heading2"/>
+        <w:spacing w:after="120" w:before="280"/>
+      </w:pPr>
+      <w:r>
+        <w:rPr>
+          <w:rFonts w:ascii="Arial" w:cs="Arial" w:eastAsia="Arial" w:hAnsi="Arial"/>
+          <w:b/>
+          <w:bCs/>
+          <w:color w:val="0B6650"/>
+          <w:sz w:val="26"/>
+          <w:szCs w:val="26"/>
+        </w:rPr>
+        <w:t xml:space="preserve">8.3 Coûts Annuels Supplémentaires des Stores</w:t>
+      </w:r>
+    </w:p>
+    <w:p>
+      <w:pPr>
+        <w:spacing w:after="60" w:before="60"/>
+      </w:pPr>
+      <w:r>
+        <w:rPr>
+          <w:rFonts w:ascii="Arial" w:cs="Arial" w:eastAsia="Arial" w:hAnsi="Arial"/>
+          <w:color w:val="1E1E1E"/>
+          <w:sz w:val="22"/>
+          <w:szCs w:val="22"/>
+        </w:rPr>
+        <w:t xml:space="preserve">Contrairement à une PWA (zéro frais de distribution), les apps natives impliquent des frais annuels obligatoires :</w:t>
+      </w:r>
+    </w:p>
+    <w:p>
+      <w:pPr>
+        <w:numPr>
+          <w:ilvl w:val="0"/>
+          <w:numId w:val="1"/>
+        </w:numPr>
+        <w:spacing w:after="40" w:before="40"/>
+      </w:pPr>
+      <w:r>
+        <w:rPr>
+          <w:rFonts w:ascii="Arial" w:cs="Arial" w:eastAsia="Arial" w:hAnsi="Arial"/>
+          <w:color w:val="1E1E1E"/>
+          <w:sz w:val="22"/>
+          <w:szCs w:val="22"/>
+        </w:rPr>
+        <w:t xml:space="preserve">Apple Developer Program : 99 USD/an (≈ €92/an) — requis pour publier sur l’App Store et accéder à APNs (notifications push iOS)</w:t>
+      </w:r>
+    </w:p>
+    <w:p>
+      <w:pPr>
+        <w:numPr>
+          <w:ilvl w:val="0"/>
+          <w:numId w:val="1"/>
+        </w:numPr>
+        <w:spacing w:after="40" w:before="40"/>
+      </w:pPr>
+      <w:r>
+        <w:rPr>
+          <w:rFonts w:ascii="Arial" w:cs="Arial" w:eastAsia="Arial" w:hAnsi="Arial"/>
+          <w:color w:val="1E1E1E"/>
+          <w:sz w:val="22"/>
+          <w:szCs w:val="22"/>
+        </w:rPr>
+        <w:t xml:space="preserve">Google Play Console : 25 USD one-time (frais unique) — aucun renouvellement</w:t>
+      </w:r>
+    </w:p>
+    <w:p>
+      <w:pPr>
+        <w:numPr>
+          <w:ilvl w:val="0"/>
+          <w:numId w:val="1"/>
+        </w:numPr>
+        <w:spacing w:after="40" w:before="40"/>
+      </w:pPr>
+      <w:r>
+        <w:rPr>
+          <w:rFonts w:ascii="Arial" w:cs="Arial" w:eastAsia="Arial" w:hAnsi="Arial"/>
+          <w:color w:val="1E1E1E"/>
+          <w:sz w:val="22"/>
+          <w:szCs w:val="22"/>
+        </w:rPr>
+        <w:t xml:space="preserve">Certificats de signature de code (code signing) : inclus dans les frais Apple, gratuit côté Android</w:t>
+      </w:r>
+    </w:p>
+    <w:p>
+      <w:pPr>
+        <w:numPr>
+          <w:ilvl w:val="0"/>
+          <w:numId w:val="1"/>
+        </w:numPr>
+        <w:spacing w:after="40" w:before="40"/>
+      </w:pPr>
+      <w:r>
+        <w:rPr>
+          <w:rFonts w:ascii="Arial" w:cs="Arial" w:eastAsia="Arial" w:hAnsi="Arial"/>
+          <w:color w:val="1E1E1E"/>
+          <w:sz w:val="22"/>
+          <w:szCs w:val="22"/>
+        </w:rPr>
+        <w:t xml:space="preserve">Renouvellement et maintenance OS : chaque mise à jour majeure d’iOS ou Android peut nécessiter 1 à 3 jours de développement</w:t>
+      </w:r>
+    </w:p>
+    <w:p>
+      <w:pPr>
+        <w:numPr>
+          <w:ilvl w:val="0"/>
+          <w:numId w:val="1"/>
+        </w:numPr>
+        <w:spacing w:after="40" w:before="40"/>
+      </w:pPr>
+      <w:r>
+        <w:rPr>
+          <w:rFonts w:ascii="Arial" w:cs="Arial" w:eastAsia="Arial" w:hAnsi="Arial"/>
+          <w:color w:val="1E1E1E"/>
+          <w:sz w:val="22"/>
+          <w:szCs w:val="22"/>
+        </w:rPr>
+        <w:t xml:space="preserve">Délai de validation Apple : 1 à 7 jours ouvrables par version soumise (Google Play : quelques heures)</w:t>
+      </w:r>
+    </w:p>
+    <w:p>
+      <w:pPr>
+        <w:spacing w:after="80" w:before="120"/>
+      </w:pPr>
+      <w:r>
+        <w:rPr>
+          <w:rFonts w:ascii="Arial" w:cs="Arial" w:eastAsia="Arial" w:hAnsi="Arial"/>
+          <w:b/>
+          <w:bCs/>
+          <w:color w:val="0B6650"/>
+          <w:sz w:val="22"/>
+          <w:szCs w:val="22"/>
+        </w:rPr>
+        <w:t xml:space="preserve">→  Coût annuel fixe supplémentaire : €92 (Apple) + €23 one-time (Google) + ~€600–1 500 maintenance OS annuelle.</w:t>
+      </w:r>
+    </w:p>
+    <w:p>
+      <w:pPr>
+        <w:pStyle w:val="Heading2"/>
+        <w:spacing w:after="120" w:before="280"/>
+      </w:pPr>
+      <w:r>
+        <w:rPr>
+          <w:rFonts w:ascii="Arial" w:cs="Arial" w:eastAsia="Arial" w:hAnsi="Arial"/>
+          <w:b/>
+          <w:bCs/>
+          <w:color w:val="0B6650"/>
+          <w:sz w:val="26"/>
+          <w:szCs w:val="26"/>
+        </w:rPr>
+        <w:t xml:space="preserve">8.4 Impact sur les Coûts Variables : la Grande Opportunité TTS</w:t>
+      </w:r>
+    </w:p>
+    <w:p>
+      <w:pPr>
+        <w:spacing w:after="60" w:before="60"/>
+      </w:pPr>
+      <w:r>
+        <w:rPr>
+          <w:rFonts w:ascii="Arial" w:cs="Arial" w:eastAsia="Arial" w:hAnsi="Arial"/>
+          <w:color w:val="1E1E1E"/>
+          <w:sz w:val="22"/>
+          <w:szCs w:val="22"/>
+        </w:rPr>
+        <w:t xml:space="preserve">Le passage au natif ouvre une opportunité majeure : utiliser la synthèse vocale intégrée au système d’exploitation, éliminant totalement ElevenLabs pour les textes non critiques.</w:t>
+      </w:r>
+    </w:p>
+    <w:p>
+      <w:pPr>
+        <w:numPr>
+          <w:ilvl w:val="0"/>
+          <w:numId w:val="1"/>
+        </w:numPr>
+        <w:spacing w:after="40" w:before="40"/>
+      </w:pPr>
+      <w:r>
+        <w:rPr>
+          <w:rFonts w:ascii="Arial" w:cs="Arial" w:eastAsia="Arial" w:hAnsi="Arial"/>
+          <w:color w:val="1E1E1E"/>
+          <w:sz w:val="22"/>
+          <w:szCs w:val="22"/>
+        </w:rPr>
+        <w:t xml:space="preserve">iOS — AVSpeechSynthesizer : voix haute qualité incluses (Improved Siri voices), en français belge, entièrement gratuit, aucun appel réseau requis, fonctionne hors ligne</w:t>
+      </w:r>
+    </w:p>
+    <w:p>
+      <w:pPr>
+        <w:numPr>
+          <w:ilvl w:val="0"/>
+          <w:numId w:val="1"/>
+        </w:numPr>
+        <w:spacing w:after="40" w:before="40"/>
+      </w:pPr>
+      <w:r>
+        <w:rPr>
+          <w:rFonts w:ascii="Arial" w:cs="Arial" w:eastAsia="Arial" w:hAnsi="Arial"/>
+          <w:color w:val="1E1E1E"/>
+          <w:sz w:val="22"/>
+          <w:szCs w:val="22"/>
+        </w:rPr>
+        <w:t xml:space="preserve">Android — TextToSpeech API : moteur TTS Google disponible sur tous les appareils Android, gratuit, support multilingue, qualité variable selon l’appareil</w:t>
+      </w:r>
+    </w:p>
+    <w:p>
+      <w:pPr>
+        <w:numPr>
+          <w:ilvl w:val="0"/>
+          <w:numId w:val="1"/>
+        </w:numPr>
+        <w:spacing w:after="40" w:before="40"/>
+      </w:pPr>
+      <w:r>
+        <w:rPr>
+          <w:rFonts w:ascii="Arial" w:cs="Arial" w:eastAsia="Arial" w:hAnsi="Arial"/>
+          <w:color w:val="1E1E1E"/>
+          <w:sz w:val="22"/>
+          <w:szCs w:val="22"/>
+        </w:rPr>
+        <w:t xml:space="preserve">Stratégie hybride recommandée : TTS natif pour les messages courants (salutation, confirmations), ElevenLabs conservé uniquement pour les messages à fort impact émotionnel (urgence, hypoglycemia critique)</w:t>
+      </w:r>
+    </w:p>
+    <w:p>
+      <w:r>
+        <w:t xml:space="preserve"/>
+      </w:r>
+    </w:p>
+    <w:tbl>
+      <w:tblPr>
+        <w:tblW w:type="dxa" w:w="9506"/>
+        <w:tblBorders>
+          <w:insideH w:val="single" w:color="D0D5DD" w:sz="1"/>
+          <w:insideV w:val="single" w:color="D0D5DD" w:sz="1"/>
+        </w:tblBorders>
+      </w:tblPr>
+      <w:tblGrid>
+        <w:gridCol w:w="3800"/>
+        <w:gridCol w:w="2853"/>
+        <w:gridCol w:w="2853"/>
+      </w:tblGrid>
+      <w:tr>
+        <w:trPr>
+          <w:tblHeader/>
+        </w:trPr>
+        <w:tc>
+          <w:tcPr>
+            <w:tcW w:type="dxa" w:w="3800"/>
+            <w:shd w:fill="1D3A6E" w:val="clear"/>
+            <w:tcMar>
+              <w:top w:type="dxa" w:w="100"/>
+              <w:left w:type="dxa" w:w="140"/>
+              <w:bottom w:type="dxa" w:w="100"/>
+              <w:right w:type="dxa" w:w="140"/>
+            </w:tcMar>
+          </w:tcPr>
+          <w:p>
+            <w:r>
+              <w:rPr>
+                <w:rFonts w:ascii="Arial" w:cs="Arial" w:eastAsia="Arial" w:hAnsi="Arial"/>
+                <w:b/>
+                <w:bCs/>
+                <w:color w:val="FFFFFF"/>
+                <w:sz w:val="20"/>
+                <w:szCs w:val="20"/>
+              </w:rPr>
+              <w:t>Scénario TTS</w:t>
+            </w:r>
+          </w:p>
+        </w:tc>
+        <w:tc>
+          <w:tcPr>
+            <w:tcW w:type="dxa" w:w="2853"/>
+            <w:shd w:fill="1D3A6E" w:val="clear"/>
+            <w:tcMar>
+              <w:top w:type="dxa" w:w="100"/>
+              <w:left w:type="dxa" w:w="140"/>
+              <w:bottom w:type="dxa" w:w="100"/>
+              <w:right w:type="dxa" w:w="140"/>
+            </w:tcMar>
+          </w:tcPr>
+          <w:p>
+            <w:r>
+              <w:rPr>
+                <w:rFonts w:ascii="Arial" w:cs="Arial" w:eastAsia="Arial" w:hAnsi="Arial"/>
+                <w:b/>
+                <w:bCs/>
+                <w:color w:val="FFFFFF"/>
+                <w:sz w:val="20"/>
+                <w:szCs w:val="20"/>
+              </w:rPr>
+              <w:t>Coût TTS/user/mois</w:t>
+            </w:r>
+          </w:p>
+        </w:tc>
+        <w:tc>
+          <w:tcPr>
+            <w:tcW w:type="dxa" w:w="2853"/>
+            <w:shd w:fill="1D3A6E" w:val="clear"/>
+            <w:tcMar>
+              <w:top w:type="dxa" w:w="100"/>
+              <w:left w:type="dxa" w:w="140"/>
+              <w:bottom w:type="dxa" w:w="100"/>
+              <w:right w:type="dxa" w:w="140"/>
+            </w:tcMar>
+          </w:tcPr>
+          <w:p>
+            <w:r>
+              <w:rPr>
+                <w:rFonts w:ascii="Arial" w:cs="Arial" w:eastAsia="Arial" w:hAnsi="Arial"/>
+                <w:b/>
+                <w:bCs/>
+                <w:color w:val="FFFFFF"/>
+                <w:sz w:val="20"/>
+                <w:szCs w:val="20"/>
+              </w:rPr>
+              <w:t>Coût total variable/user/mois</w:t>
+            </w:r>
+          </w:p>
+        </w:tc>
+      </w:tr>
+      <w:tr>
+        <w:tc>
+          <w:tcPr>
+            <w:tcW w:type="dxa" w:w="3800"/>
+            <w:shd w:fill="F0F4FA" w:val="clear"/>
+            <w:tcMar>
+              <w:top w:type="dxa" w:w="100"/>
+              <w:left w:type="dxa" w:w="140"/>
+              <w:bottom w:type="dxa" w:w="100"/>
+              <w:right w:type="dxa" w:w="140"/>
+            </w:tcMar>
+          </w:tcPr>
+          <w:p>
+            <w:r>
+              <w:rPr>
+                <w:rFonts w:ascii="Arial" w:cs="Arial" w:eastAsia="Arial" w:hAnsi="Arial"/>
+                <w:color w:val="1E1E1E"/>
+                <w:sz w:val="20"/>
+                <w:szCs w:val="20"/>
+              </w:rPr>
+              <w:t xml:space="preserve">PWA — ElevenLabs sans cache</w:t>
+            </w:r>
+          </w:p>
+        </w:tc>
+        <w:tc>
+          <w:tcPr>
+            <w:tcW w:type="dxa" w:w="2853"/>
+            <w:shd w:fill="F0F4FA" w:val="clear"/>
+            <w:tcMar>
+              <w:top w:type="dxa" w:w="100"/>
+              <w:left w:type="dxa" w:w="140"/>
+              <w:bottom w:type="dxa" w:w="100"/>
+              <w:right w:type="dxa" w:w="140"/>
+            </w:tcMar>
+          </w:tcPr>
+          <w:p>
+            <w:r>
+              <w:rPr>
+                <w:rFonts w:ascii="Arial" w:cs="Arial" w:eastAsia="Arial" w:hAnsi="Arial"/>
+                <w:color w:val="1E1E1E"/>
+                <w:sz w:val="20"/>
+                <w:szCs w:val="20"/>
+              </w:rPr>
+              <w:t xml:space="preserve">$7,56</w:t>
+            </w:r>
+          </w:p>
+        </w:tc>
+        <w:tc>
+          <w:tcPr>
+            <w:tcW w:type="dxa" w:w="2853"/>
+            <w:shd w:fill="F0F4FA" w:val="clear"/>
+            <w:tcMar>
+              <w:top w:type="dxa" w:w="100"/>
+              <w:left w:type="dxa" w:w="140"/>
+              <w:bottom w:type="dxa" w:w="100"/>
+              <w:right w:type="dxa" w:w="140"/>
+            </w:tcMar>
+          </w:tcPr>
+          <w:p>
+            <w:r>
+              <w:rPr>
+                <w:rFonts w:ascii="Arial" w:cs="Arial" w:eastAsia="Arial" w:hAnsi="Arial"/>
+                <w:color w:val="1E1E1E"/>
+                <w:sz w:val="20"/>
+                <w:szCs w:val="20"/>
+              </w:rPr>
+              <w:t xml:space="preserve">€7,89</w:t>
+            </w:r>
+          </w:p>
+        </w:tc>
+      </w:tr>
+      <w:tr>
+        <w:tc>
+          <w:tcPr>
+            <w:tcW w:type="dxa" w:w="3800"/>
+            <w:shd w:fill="FFFFFF" w:val="clear"/>
+            <w:tcMar>
+              <w:top w:type="dxa" w:w="100"/>
+              <w:left w:type="dxa" w:w="140"/>
+              <w:bottom w:type="dxa" w:w="100"/>
+              <w:right w:type="dxa" w:w="140"/>
+            </w:tcMar>
+          </w:tcPr>
+          <w:p>
+            <w:r>
+              <w:rPr>
+                <w:rFonts w:ascii="Arial" w:cs="Arial" w:eastAsia="Arial" w:hAnsi="Arial"/>
+                <w:color w:val="1E1E1E"/>
+                <w:sz w:val="20"/>
+                <w:szCs w:val="20"/>
+              </w:rPr>
+              <w:t xml:space="preserve">PWA — ElevenLabs avec cache Redis (actuel)</w:t>
+            </w:r>
+          </w:p>
+        </w:tc>
+        <w:tc>
+          <w:tcPr>
+            <w:tcW w:type="dxa" w:w="2853"/>
+            <w:shd w:fill="FFFFFF" w:val="clear"/>
+            <w:tcMar>
+              <w:top w:type="dxa" w:w="100"/>
+              <w:left w:type="dxa" w:w="140"/>
+              <w:bottom w:type="dxa" w:w="100"/>
+              <w:right w:type="dxa" w:w="140"/>
+            </w:tcMar>
+          </w:tcPr>
+          <w:p>
+            <w:r>
+              <w:rPr>
+                <w:rFonts w:ascii="Arial" w:cs="Arial" w:eastAsia="Arial" w:hAnsi="Arial"/>
+                <w:color w:val="1E1E1E"/>
+                <w:sz w:val="20"/>
+                <w:szCs w:val="20"/>
+              </w:rPr>
+              <w:t xml:space="preserve">$2,72</w:t>
+            </w:r>
+          </w:p>
+        </w:tc>
+        <w:tc>
+          <w:tcPr>
+            <w:tcW w:type="dxa" w:w="2853"/>
+            <w:shd w:fill="FFFFFF" w:val="clear"/>
+            <w:tcMar>
+              <w:top w:type="dxa" w:w="100"/>
+              <w:left w:type="dxa" w:w="140"/>
+              <w:bottom w:type="dxa" w:w="100"/>
+              <w:right w:type="dxa" w:w="140"/>
+            </w:tcMar>
+          </w:tcPr>
+          <w:p>
+            <w:r>
+              <w:rPr>
+                <w:rFonts w:ascii="Arial" w:cs="Arial" w:eastAsia="Arial" w:hAnsi="Arial"/>
+                <w:color w:val="1E1E1E"/>
+                <w:sz w:val="20"/>
+                <w:szCs w:val="20"/>
+              </w:rPr>
+              <w:t xml:space="preserve">€3,05</w:t>
+            </w:r>
+          </w:p>
+        </w:tc>
+      </w:tr>
+      <w:tr>
+        <w:tc>
+          <w:tcPr>
+            <w:tcW w:type="dxa" w:w="3800"/>
+            <w:shd w:fill="F0F4FA" w:val="clear"/>
+            <w:tcMar>
+              <w:top w:type="dxa" w:w="100"/>
+              <w:left w:type="dxa" w:w="140"/>
+              <w:bottom w:type="dxa" w:w="100"/>
+              <w:right w:type="dxa" w:w="140"/>
+            </w:tcMar>
+          </w:tcPr>
+          <w:p>
+            <w:r>
+              <w:rPr>
+                <w:rFonts w:ascii="Arial" w:cs="Arial" w:eastAsia="Arial" w:hAnsi="Arial"/>
+                <w:color w:val="1E1E1E"/>
+                <w:sz w:val="20"/>
+                <w:szCs w:val="20"/>
+              </w:rPr>
+              <w:t xml:space="preserve">Natif — TTS système uniquement (100 %)</w:t>
+            </w:r>
+          </w:p>
+        </w:tc>
+        <w:tc>
+          <w:tcPr>
+            <w:tcW w:type="dxa" w:w="2853"/>
+            <w:shd w:fill="F0F4FA" w:val="clear"/>
+            <w:tcMar>
+              <w:top w:type="dxa" w:w="100"/>
+              <w:left w:type="dxa" w:w="140"/>
+              <w:bottom w:type="dxa" w:w="100"/>
+              <w:right w:type="dxa" w:w="140"/>
+            </w:tcMar>
+          </w:tcPr>
+          <w:p>
+            <w:r>
+              <w:rPr>
+                <w:rFonts w:ascii="Arial" w:cs="Arial" w:eastAsia="Arial" w:hAnsi="Arial"/>
+                <w:color w:val="1E1E1E"/>
+                <w:sz w:val="20"/>
+                <w:szCs w:val="20"/>
+              </w:rPr>
+              <w:t xml:space="preserve">$0,00</w:t>
+            </w:r>
+          </w:p>
+        </w:tc>
+        <w:tc>
+          <w:tcPr>
+            <w:tcW w:type="dxa" w:w="2853"/>
+            <w:shd w:fill="F0F4FA" w:val="clear"/>
+            <w:tcMar>
+              <w:top w:type="dxa" w:w="100"/>
+              <w:left w:type="dxa" w:w="140"/>
+              <w:bottom w:type="dxa" w:w="100"/>
+              <w:right w:type="dxa" w:w="140"/>
+            </w:tcMar>
+          </w:tcPr>
+          <w:p>
+            <w:r>
+              <w:rPr>
+                <w:rFonts w:ascii="Arial" w:cs="Arial" w:eastAsia="Arial" w:hAnsi="Arial"/>
+                <w:color w:val="1E1E1E"/>
+                <w:sz w:val="20"/>
+                <w:szCs w:val="20"/>
+              </w:rPr>
+              <w:t xml:space="preserve">€0,33</w:t>
+            </w:r>
+          </w:p>
+        </w:tc>
+      </w:tr>
+      <w:tr>
+        <w:tc>
+          <w:tcPr>
+            <w:tcW w:type="dxa" w:w="3800"/>
+            <w:shd w:fill="FFFFFF" w:val="clear"/>
+            <w:tcMar>
+              <w:top w:type="dxa" w:w="100"/>
+              <w:left w:type="dxa" w:w="140"/>
+              <w:bottom w:type="dxa" w:w="100"/>
+              <w:right w:type="dxa" w:w="140"/>
+            </w:tcMar>
+          </w:tcPr>
+          <w:p>
+            <w:r>
+              <w:rPr>
+                <w:rFonts w:ascii="Arial" w:cs="Arial" w:eastAsia="Arial" w:hAnsi="Arial"/>
+                <w:b/>
+                <w:bCs/>
+                <w:color w:val="1E1E1E"/>
+                <w:sz w:val="20"/>
+                <w:szCs w:val="20"/>
+              </w:rPr>
+              <w:t xml:space="preserve">Natif — Hybride (80 % système + 20 % ElevenLabs)</w:t>
+            </w:r>
+          </w:p>
+        </w:tc>
+        <w:tc>
+          <w:tcPr>
+            <w:tcW w:type="dxa" w:w="2853"/>
+            <w:shd w:fill="FFFFFF" w:val="clear"/>
+            <w:tcMar>
+              <w:top w:type="dxa" w:w="100"/>
+              <w:left w:type="dxa" w:w="140"/>
+              <w:bottom w:type="dxa" w:w="100"/>
+              <w:right w:type="dxa" w:w="140"/>
+            </w:tcMar>
+          </w:tcPr>
+          <w:p>
+            <w:r>
+              <w:rPr>
+                <w:rFonts w:ascii="Arial" w:cs="Arial" w:eastAsia="Arial" w:hAnsi="Arial"/>
+                <w:b/>
+                <w:bCs/>
+                <w:color w:val="1E1E1E"/>
+                <w:sz w:val="20"/>
+                <w:szCs w:val="20"/>
+              </w:rPr>
+              <w:t xml:space="preserve">$0,54</w:t>
+            </w:r>
+          </w:p>
+        </w:tc>
+        <w:tc>
+          <w:tcPr>
+            <w:tcW w:type="dxa" w:w="2853"/>
+            <w:shd w:fill="E8F5EE" w:val="clear"/>
+            <w:tcMar>
+              <w:top w:type="dxa" w:w="100"/>
+              <w:left w:type="dxa" w:w="140"/>
+              <w:bottom w:type="dxa" w:w="100"/>
+              <w:right w:type="dxa" w:w="140"/>
+            </w:tcMar>
+          </w:tcPr>
+          <w:p>
+            <w:r>
+              <w:rPr>
+                <w:rFonts w:ascii="Arial" w:cs="Arial" w:eastAsia="Arial" w:hAnsi="Arial"/>
+                <w:b/>
+                <w:bCs/>
+                <w:color w:val="0B6650"/>
+                <w:sz w:val="20"/>
+                <w:szCs w:val="20"/>
+              </w:rPr>
+              <w:t xml:space="preserve">€0,87</w:t>
+            </w:r>
+          </w:p>
+        </w:tc>
+      </w:tr>
+    </w:tbl>
+    <w:p>
+      <w:pPr>
+        <w:spacing w:after="80" w:before="120"/>
+      </w:pPr>
+      <w:r>
+        <w:rPr>
+          <w:rFonts w:ascii="Arial" w:cs="Arial" w:eastAsia="Arial" w:hAnsi="Arial"/>
+          <w:b/>
+          <w:bCs/>
+          <w:color w:val="0B6650"/>
+          <w:sz w:val="22"/>
+          <w:szCs w:val="22"/>
+        </w:rPr>
+        <w:t xml:space="preserve">→  Le scénario hybride (80 % TTS natif + 20 % ElevenLabs pour les moments clés) ramène le coût variable à €0,87/user/mois — soit une réduction de 89 % vs la PWA sans optimisation.</w:t>
+      </w:r>
+    </w:p>
+    <w:p>
+      <w:pPr>
+        <w:pStyle w:val="Heading2"/>
+        <w:spacing w:after="120" w:before="280"/>
+      </w:pPr>
+      <w:r>
+        <w:rPr>
+          <w:rFonts w:ascii="Arial" w:cs="Arial" w:eastAsia="Arial" w:hAnsi="Arial"/>
+          <w:b/>
+          <w:bCs/>
+          <w:color w:val="0B6650"/>
+          <w:sz w:val="26"/>
+          <w:szCs w:val="26"/>
+        </w:rPr>
+        <w:t xml:space="preserve">8.5 Avantages et Contraintes du Natif</w:t>
+      </w:r>
+    </w:p>
+    <w:p>
+      <w:pPr>
+        <w:spacing w:after="40" w:before="80"/>
+      </w:pPr>
+      <w:r>
+        <w:rPr>
+          <w:rFonts w:ascii="Arial" w:cs="Arial" w:eastAsia="Arial" w:hAnsi="Arial"/>
+          <w:b/>
+          <w:bCs/>
+          <w:color w:val="0B6650"/>
+          <w:sz w:val="22"/>
+          <w:szCs w:val="22"/>
+        </w:rPr>
+        <w:t xml:space="preserve">Ce que le natif apporte en plus :</w:t>
+      </w:r>
+    </w:p>
+    <w:p>
+      <w:pPr>
+        <w:numPr>
+          <w:ilvl w:val="0"/>
+          <w:numId w:val="1"/>
+        </w:numPr>
+        <w:spacing w:after="40" w:before="40"/>
+      </w:pPr>
+      <w:r>
+        <w:rPr>
+          <w:rFonts w:ascii="Arial" w:cs="Arial" w:eastAsia="Arial" w:hAnsi="Arial"/>
+          <w:color w:val="1E1E1E"/>
+          <w:sz w:val="22"/>
+          <w:szCs w:val="22"/>
+        </w:rPr>
+        <w:t xml:space="preserve">Notifications push fiables en arrière-plan (APNs iOS — les SW notifications sont limitées sur iOS Safari)</w:t>
+      </w:r>
+    </w:p>
+    <w:p>
+      <w:pPr>
+        <w:numPr>
+          <w:ilvl w:val="0"/>
+          <w:numId w:val="1"/>
+        </w:numPr>
+        <w:spacing w:after="40" w:before="40"/>
+      </w:pPr>
+      <w:r>
+        <w:rPr>
+          <w:rFonts w:ascii="Arial" w:cs="Arial" w:eastAsia="Arial" w:hAnsi="Arial"/>
+          <w:color w:val="1E1E1E"/>
+          <w:sz w:val="22"/>
+          <w:szCs w:val="22"/>
+        </w:rPr>
+        <w:t xml:space="preserve">Intégration HealthKit (iOS) et Google Fit (Android) : import automatique des données de glycémie depuis des appareils connectés</w:t>
+      </w:r>
+    </w:p>
+    <w:p>
+      <w:pPr>
+        <w:numPr>
+          <w:ilvl w:val="0"/>
+          <w:numId w:val="1"/>
+        </w:numPr>
+        <w:spacing w:after="40" w:before="40"/>
+      </w:pPr>
+      <w:r>
+        <w:rPr>
+          <w:rFonts w:ascii="Arial" w:cs="Arial" w:eastAsia="Arial" w:hAnsi="Arial"/>
+          <w:color w:val="1E1E1E"/>
+          <w:sz w:val="22"/>
+          <w:szCs w:val="22"/>
+        </w:rPr>
+        <w:t xml:space="preserve">Bluetooth : connexion directe avec glucomètres (Dexcom, Abbott FreeStyle, Contour) sans interface manuelle</w:t>
+      </w:r>
+    </w:p>
+    <w:p>
+      <w:pPr>
+        <w:numPr>
+          <w:ilvl w:val="0"/>
+          <w:numId w:val="1"/>
+        </w:numPr>
+        <w:spacing w:after="40" w:before="40"/>
+      </w:pPr>
+      <w:r>
+        <w:rPr>
+          <w:rFonts w:ascii="Arial" w:cs="Arial" w:eastAsia="Arial" w:hAnsi="Arial"/>
+          <w:color w:val="1E1E1E"/>
+          <w:sz w:val="22"/>
+          <w:szCs w:val="22"/>
+        </w:rPr>
+        <w:t xml:space="preserve">Performance et animations natives — expérience plus fluide, accès aux APIs haptics, accéléromètre</w:t>
+      </w:r>
+    </w:p>
+    <w:p>
+      <w:pPr>
+        <w:numPr>
+          <w:ilvl w:val="0"/>
+          <w:numId w:val="1"/>
+        </w:numPr>
+        <w:spacing w:after="40" w:before="40"/>
+      </w:pPr>
+      <w:r>
+        <w:rPr>
+          <w:rFonts w:ascii="Arial" w:cs="Arial" w:eastAsia="Arial" w:hAnsi="Arial"/>
+          <w:color w:val="1E1E1E"/>
+          <w:sz w:val="22"/>
+          <w:szCs w:val="22"/>
+        </w:rPr>
+        <w:t xml:space="preserve">Présence dans les stores : meilleure visibilité et crédibilité pour une app médicale</w:t>
+      </w:r>
+    </w:p>
+    <w:p>
+      <w:pPr>
+        <w:spacing w:after="40" w:before="80"/>
+      </w:pPr>
+      <w:r>
+        <w:rPr>
+          <w:rFonts w:ascii="Arial" w:cs="Arial" w:eastAsia="Arial" w:hAnsi="Arial"/>
+          <w:b/>
+          <w:bCs/>
+          <w:color w:val="C0392B"/>
+          <w:sz w:val="22"/>
+          <w:szCs w:val="22"/>
+        </w:rPr>
+        <w:t xml:space="preserve">Ce que le natif coûte en plus :</w:t>
+      </w:r>
+    </w:p>
+    <w:p>
+      <w:pPr>
+        <w:numPr>
+          <w:ilvl w:val="0"/>
+          <w:numId w:val="1"/>
+        </w:numPr>
+        <w:spacing w:after="40" w:before="40"/>
+      </w:pPr>
+      <w:r>
+        <w:rPr>
+          <w:rFonts w:ascii="Arial" w:cs="Arial" w:eastAsia="Arial" w:hAnsi="Arial"/>
+          <w:color w:val="1E1E1E"/>
+          <w:sz w:val="22"/>
+          <w:szCs w:val="22"/>
+        </w:rPr>
+        <w:t xml:space="preserve">Cycle de développement plus long : chaque fonctionnalité doit être implémentée et testée sur deux plateformes</w:t>
+      </w:r>
+    </w:p>
+    <w:p>
+      <w:pPr>
+        <w:numPr>
+          <w:ilvl w:val="0"/>
+          <w:numId w:val="1"/>
+        </w:numPr>
+        <w:spacing w:after="40" w:before="40"/>
+      </w:pPr>
+      <w:r>
+        <w:rPr>
+          <w:rFonts w:ascii="Arial" w:cs="Arial" w:eastAsia="Arial" w:hAnsi="Arial"/>
+          <w:color w:val="1E1E1E"/>
+          <w:sz w:val="22"/>
+          <w:szCs w:val="22"/>
+        </w:rPr>
+        <w:t xml:space="preserve">Soumission Apple contraignante : validation manuelle, risque de rejet (conformité aux guidelines médicales App Store)</w:t>
+      </w:r>
+    </w:p>
+    <w:p>
+      <w:pPr>
+        <w:numPr>
+          <w:ilvl w:val="0"/>
+          <w:numId w:val="1"/>
+        </w:numPr>
+        <w:spacing w:after="40" w:before="40"/>
+      </w:pPr>
+      <w:r>
+        <w:rPr>
+          <w:rFonts w:ascii="Arial" w:cs="Arial" w:eastAsia="Arial" w:hAnsi="Arial"/>
+          <w:color w:val="1E1E1E"/>
+          <w:sz w:val="22"/>
+          <w:szCs w:val="22"/>
+        </w:rPr>
+        <w:t xml:space="preserve">Maintenance OS : mises à jour obligatoires à chaque nouvelle version d’iOS / Android (1–3 j/an)</w:t>
+      </w:r>
+    </w:p>
+    <w:p>
+      <w:pPr>
+        <w:numPr>
+          <w:ilvl w:val="0"/>
+          <w:numId w:val="1"/>
+        </w:numPr>
+        <w:spacing w:after="40" w:before="40"/>
+      </w:pPr>
+      <w:r>
+        <w:rPr>
+          <w:rFonts w:ascii="Arial" w:cs="Arial" w:eastAsia="Arial" w:hAnsi="Arial"/>
+          <w:color w:val="1E1E1E"/>
+          <w:sz w:val="22"/>
+          <w:szCs w:val="22"/>
+        </w:rPr>
+        <w:t xml:space="preserve">Perte de la souplesse PWA : déploiement instantané impossible, chaque modification nécessite une soumission store</w:t>
+      </w:r>
+    </w:p>
+    <w:p>
+      <w:pPr>
+        <w:pStyle w:val="Heading2"/>
+        <w:spacing w:after="120" w:before="280"/>
+      </w:pPr>
+      <w:r>
+        <w:rPr>
+          <w:rFonts w:ascii="Arial" w:cs="Arial" w:eastAsia="Arial" w:hAnsi="Arial"/>
+          <w:b/>
+          <w:bCs/>
+          <w:color w:val="0B6650"/>
+          <w:sz w:val="26"/>
+          <w:szCs w:val="26"/>
+        </w:rPr>
+        <w:t xml:space="preserve">8.6 Recommandation Stratégique</w:t>
+      </w:r>
+    </w:p>
+    <w:p>
+      <w:pPr>
+        <w:spacing w:after="60" w:before="60"/>
+      </w:pPr>
+      <w:r>
+        <w:rPr>
+          <w:rFonts w:ascii="Arial" w:cs="Arial" w:eastAsia="Arial" w:hAnsi="Arial"/>
+          <w:color w:val="1E1E1E"/>
+          <w:sz w:val="22"/>
+          <w:szCs w:val="22"/>
+        </w:rPr>
+        <w:t xml:space="preserve">La PWA reste la bonne décision pour la phase actuelle. Le passage au natif se justifiera lorsque :</w:t>
+      </w:r>
+    </w:p>
+    <w:p>
+      <w:pPr>
+        <w:numPr>
+          <w:ilvl w:val="0"/>
+          <w:numId w:val="1"/>
+        </w:numPr>
+        <w:spacing w:after="40" w:before="40"/>
+      </w:pPr>
+      <w:r>
+        <w:rPr>
+          <w:rFonts w:ascii="Arial" w:cs="Arial" w:eastAsia="Arial" w:hAnsi="Arial"/>
+          <w:color w:val="1E1E1E"/>
+          <w:sz w:val="22"/>
+          <w:szCs w:val="22"/>
+        </w:rPr>
+        <w:t xml:space="preserve">La base atteint 200+ utilisateurs actifs et que les marges valident l’investissement supplémentaire</w:t>
+      </w:r>
+    </w:p>
+    <w:p>
+      <w:pPr>
+        <w:numPr>
+          <w:ilvl w:val="0"/>
+          <w:numId w:val="1"/>
+        </w:numPr>
+        <w:spacing w:after="40" w:before="40"/>
+      </w:pPr>
+      <w:r>
+        <w:rPr>
+          <w:rFonts w:ascii="Arial" w:cs="Arial" w:eastAsia="Arial" w:hAnsi="Arial"/>
+          <w:color w:val="1E1E1E"/>
+          <w:sz w:val="22"/>
+          <w:szCs w:val="22"/>
+        </w:rPr>
+        <w:t xml:space="preserve">L’intégration Bluetooth glucomètre devient une demande forte des utilisateurs ou prescripteurs</w:t>
+      </w:r>
+    </w:p>
+    <w:p>
+      <w:pPr>
+        <w:numPr>
+          <w:ilvl w:val="0"/>
+          <w:numId w:val="1"/>
+        </w:numPr>
+        <w:spacing w:after="40" w:before="40"/>
+      </w:pPr>
+      <w:r>
+        <w:rPr>
+          <w:rFonts w:ascii="Arial" w:cs="Arial" w:eastAsia="Arial" w:hAnsi="Arial"/>
+          <w:color w:val="1E1E1E"/>
+          <w:sz w:val="22"/>
+          <w:szCs w:val="22"/>
+        </w:rPr>
+        <w:t xml:space="preserve">Les limitations iOS Safari (notifications, offline) deviennent un frein réel à la rétention</w:t>
+      </w:r>
+    </w:p>
+    <w:p>
+      <w:pPr>
+        <w:spacing w:after="40" w:before="80"/>
+      </w:pPr>
+      <w:r>
+        <w:rPr>
+          <w:rFonts w:ascii="Arial" w:cs="Arial" w:eastAsia="Arial" w:hAnsi="Arial"/>
+          <w:b/>
+          <w:bCs/>
+          <w:color w:val="1D3A6E"/>
+          <w:sz w:val="22"/>
+          <w:szCs w:val="22"/>
+        </w:rPr>
+        <w:t xml:space="preserve">Le chemin recommandé :</w:t>
+      </w:r>
+    </w:p>
+    <w:p>
+      <w:pPr>
+        <w:numPr>
+          <w:ilvl w:val="0"/>
+          <w:numId w:val="1"/>
+        </w:numPr>
+        <w:spacing w:after="40" w:before="40"/>
+      </w:pPr>
+      <w:r>
+        <w:rPr>
+          <w:rFonts w:ascii="Arial" w:cs="Arial" w:eastAsia="Arial" w:hAnsi="Arial"/>
+          <w:color w:val="1E1E1E"/>
+          <w:sz w:val="22"/>
+          <w:szCs w:val="22"/>
+        </w:rPr>
+        <w:t xml:space="preserve">Phase 1 (maintenant) : PWA optimisée avec cache TTS — coût variable €3,05/user/mois, time-to-market immédiat</w:t>
+      </w:r>
+    </w:p>
+    <w:p>
+      <w:pPr>
+        <w:numPr>
+          <w:ilvl w:val="0"/>
+          <w:numId w:val="1"/>
+        </w:numPr>
+        <w:spacing w:after="40" w:before="40"/>
+      </w:pPr>
+      <w:r>
+        <w:rPr>
+          <w:rFonts w:ascii="Arial" w:cs="Arial" w:eastAsia="Arial" w:hAnsi="Arial"/>
+          <w:color w:val="1E1E1E"/>
+          <w:sz w:val="22"/>
+          <w:szCs w:val="22"/>
+        </w:rPr>
+        <w:t xml:space="preserve">Phase 2 (à 200 users) : App native React Native assistée IA — investissement €1 125, TTS hybride à €0,87/user/mois</w:t>
+      </w:r>
+    </w:p>
+    <w:p>
+      <w:pPr>
+        <w:numPr>
+          <w:ilvl w:val="0"/>
+          <w:numId w:val="1"/>
+        </w:numPr>
+        <w:spacing w:after="40" w:before="40"/>
+      </w:pPr>
+      <w:r>
+        <w:rPr>
+          <w:rFonts w:ascii="Arial" w:cs="Arial" w:eastAsia="Arial" w:hAnsi="Arial"/>
+          <w:color w:val="1E1E1E"/>
+          <w:sz w:val="22"/>
+          <w:szCs w:val="22"/>
+        </w:rPr>
+        <w:t xml:space="preserve">Phase 3 (à 500+ users) : Natif pur Swift + Kotlin si HealthKit / Bluetooth requis — investissement €60 800 classique ou €6 000–8 000 assisté IA</w:t>
+      </w:r>
+    </w:p>
+    <w:p>
+      <w:pPr>
+        <w:spacing w:after="80" w:before="120"/>
+      </w:pPr>
+      <w:r>
+        <w:rPr>
+          <w:rFonts w:ascii="Arial" w:cs="Arial" w:eastAsia="Arial" w:hAnsi="Arial"/>
+          <w:b/>
+          <w:bCs/>
+          <w:color w:val="0B6650"/>
+          <w:sz w:val="22"/>
+          <w:szCs w:val="22"/>
+        </w:rPr>
+        <w:t xml:space="preserve">→  Conclusion : le natif multiplateforme assisté par IA réduit le coût de développement de €30 400 à €1 125 et élimine jusqu’à 89 % du coût TTS. C’est une étape rentable à partir de 200 utilisateurs.</w:t>
       </w:r>
     </w:p>
     <w:sectPr>

</xml_diff>